<commit_message>
Update 15-row field layout, pure Mecanum omnidirectional crab-walk, and Ackermann 3-point headland K-turn re-alignment navigation
</commit_message>
<xml_diff>
--- a/results/Today_Work_Summary_Ackermann_Navigation_16m.docx
+++ b/results/Today_Work_Summary_Ackermann_Navigation_16m.docx
@@ -29,9 +29,9 @@
           <w:color w:val="2E75B6"/>
           <w:sz w:val="22"/>
         </w:rPr>
-        <w:t>Mecanum Pure Crab-Walk Drive vs. Front-Wheel Ackermann Steering Benchmark (16m × 16m Arena, 9 Crop Rows)</w:t>
+        <w:t>4-Wheel Swerve Crab-Walk Drive vs. Front-Wheel Ackermann Steering Benchmark (16m × 16m Arena, 9 Crop Rows)</w:t>
         <w:br/>
-        <w:t>Workspace: C:\Users\User\Documents\git_abd | Date: August 25, 2026</w:t>
+        <w:t>Workspace: C:\Users\User\Documents\git_abd | Date: August 26, 2026</w:t>
       </w:r>
     </w:p>
     <w:p/>
@@ -68,12 +68,12 @@
         <w:rPr>
           <w:color w:val="1F4E78"/>
         </w:rPr>
-        <w:t>2. Kinematics Architecture: Ackermann vs. Mecanum Crab-Walk</w:t>
+        <w:t>2. Kinematics Architecture: Ackermann vs. Swerve Crab-Walk</w:t>
       </w:r>
     </w:p>
     <w:p>
       <w:r>
-        <w:t>Both drive architectures were implemented and benchmarked on identical 16m × 16m agricultural field setups. For the Mecanum platform in Webots, the wheel node motor mapping was calibrated to execute pure lateral Vy crab strafing along +Y without forward creep:</w:t>
+        <w:t>Both drive architectures were implemented and benchmarked on identical 16m × 16m agricultural field setups. On the Mecanum/Swerve platform, all 4 wheels possess active steering motors (steer_fl_motor, steer_fr_motor, steer_rl_motor, steer_rr_motor) allowing pure 90° lateral crab strafing along +Y in the headlands:</w:t>
       </w:r>
     </w:p>
     <w:tbl>
@@ -119,7 +119,7 @@
           </w:tcPr>
           <w:p>
             <w:r>
-              <w:t>Mecanum Pure Crab-Walk Drive</w:t>
+              <w:t>4-Wheel Swerve Crab-Walk Drive</w:t>
             </w:r>
           </w:p>
         </w:tc>
@@ -174,7 +174,7 @@
                 <w:b/>
                 <w:color w:val="1F4E78"/>
               </w:rPr>
-              <w:t>Webots Motor Signs</w:t>
+              <w:t>Steering Mechanics</w:t>
             </w:r>
           </w:p>
         </w:tc>
@@ -184,7 +184,7 @@
           </w:tcPr>
           <w:p>
             <w:r>
-              <w:t>FL/FR Steer [-44.5°, +44.5°], Fixed Rear</w:t>
+              <w:t>2 Front Steering Motors [-44.5°, +44.5°], Fixed Rear</w:t>
             </w:r>
           </w:p>
         </w:tc>
@@ -194,7 +194,7 @@
           </w:tcPr>
           <w:p>
             <w:r>
-              <w:t>Longitudinal Vx (-1, +1, +1, -1), Crab Vy (+1, +1, +1, +1)</w:t>
+              <w:t>4 Independent Steering Motors (0° In-Row, 90° Headland)</w:t>
             </w:r>
           </w:p>
         </w:tc>
@@ -233,7 +233,7 @@
           </w:tcPr>
           <w:p>
             <w:r>
-              <w:t>Rectangular 90° Lateral Crab Strafing (Vy Shift)</w:t>
+              <w:t>Rectangular 90° Lateral Crab Shift (Vy Along +Y)</w:t>
             </w:r>
           </w:p>
         </w:tc>
@@ -345,10 +345,10 @@
           <w:b/>
           <w:color w:val="2E75B6"/>
         </w:rPr>
-        <w:t xml:space="preserve">Mecanum Wheel Sign Calibration: </w:t>
+        <w:t xml:space="preserve">4-Wheel Swerve Crab Alignment: </w:t>
       </w:r>
       <w:r>
-        <w:t>Mapped Webots Mecanum wheel node axes so longitudinal drive uses (-1, +1, +1, -1) and lateral crab strafing uses (+1, +1, +1, +1), eliminating wall collision bouncing.</w:t>
+        <w:t>Configured steer_fl_motor, steer_fr_motor, steer_rl_motor, steer_rr_motor to rotate 90° (+1.5708 rad) in headland zones, enabling smooth lateral crab strafing without body rotation.</w:t>
       </w:r>
     </w:p>
     <w:p>
@@ -435,7 +435,7 @@
           </w:tcPr>
           <w:p>
             <w:r>
-              <w:t>Mecanum Crab-Walk Platform</w:t>
+              <w:t>4-Wheel Swerve Crab-Walk Platform</w:t>
             </w:r>
           </w:p>
         </w:tc>

</xml_diff>